<commit_message>
Unify v2 evidence and verify clean ns-3.47 reproduction
Regenerate the supervisor documents and figures from one canonical statistical record, make bootstrap intervals independent of call order, and document a clean-build 360-run ns-3.47 reproduction whose raw CSV matches the committed evidence byte for byte.
</commit_message>
<xml_diff>
--- a/deliverables/Wisam_Makki_Salim_Pilot_Study_v2_Technical_Report.docx
+++ b/deliverables/Wisam_Makki_Salim_Pilot_Study_v2_Technical_Report.docx
@@ -159,6 +159,9 @@
         <w:gridCol w:w="5083"/>
       </w:tblGrid>
       <w:tr>
+        <w:trPr>
+          <w:tblHeader w:val="true"/>
+        </w:trPr>
         <w:tc>
           <w:tcPr>
             <w:tcW w:type="dxa" w:w="2376"/>
@@ -543,6 +546,9 @@
         <w:gridCol w:w="2033"/>
       </w:tblGrid>
       <w:tr>
+        <w:trPr>
+          <w:tblHeader w:val="true"/>
+        </w:trPr>
         <w:tc>
           <w:tcPr>
             <w:tcW w:type="dxa" w:w="1008"/>
@@ -717,7 +723,7 @@
               <w:rPr>
                 <w:sz w:val="15"/>
               </w:rPr>
-              <w:t>+0.571 [-0.629, +2.304]</w:t>
+              <w:t>+0.571 [-0.630, +2.312]</w:t>
             </w:r>
           </w:p>
         </w:tc>
@@ -740,7 +746,7 @@
               <w:rPr>
                 <w:sz w:val="15"/>
               </w:rPr>
-              <w:t>+0.432 [0.000, +1.296]</w:t>
+              <w:t>+0.432 [+0.000, +1.296]</w:t>
             </w:r>
           </w:p>
         </w:tc>
@@ -836,7 +842,7 @@
               <w:rPr>
                 <w:sz w:val="15"/>
               </w:rPr>
-              <w:t>+1.591 [+1.214, +1.969]</w:t>
+              <w:t>+1.591 [+1.214, +1.971]</w:t>
             </w:r>
           </w:p>
         </w:tc>
@@ -956,7 +962,7 @@
               <w:rPr>
                 <w:sz w:val="15"/>
               </w:rPr>
-              <w:t>+1.453 [+1.054, +1.796]</w:t>
+              <w:t>+1.453 [+1.055, +1.796]</w:t>
             </w:r>
           </w:p>
         </w:tc>
@@ -1075,7 +1081,7 @@
               <w:rPr>
                 <w:sz w:val="15"/>
               </w:rPr>
-              <w:t>+3.392 [+2.738, +4.044]</w:t>
+              <w:t>+3.392 [+2.736, +4.049]</w:t>
             </w:r>
           </w:p>
         </w:tc>
@@ -1099,7 +1105,7 @@
               <w:rPr>
                 <w:sz w:val="15"/>
               </w:rPr>
-              <w:t>+0.404 [-0.260, +1.050]</w:t>
+              <w:t>+0.404 [-0.261, +1.055]</w:t>
             </w:r>
           </w:p>
         </w:tc>
@@ -2196,9 +2202,6 @@
     <w:qFormat/>
     <w:rsid w:val="00FC693F"/>
     <w:pPr>
-      <w:pBdr>
-        <w:bottom w:val="single" w:sz="8" w:space="4" w:color="4F81BD" w:themeColor="accent1"/>
-      </w:pBdr>
       <w:spacing w:after="120" w:line="240" w:lineRule="auto" w:before="0"/>
       <w:contextualSpacing/>
     </w:pPr>

</xml_diff>